<commit_message>
feat: embed all empirical figures across README, docs, paper, and execute all notebooks with full visual outputs
- Populate and execute all code cells in notebooks/01_data_preprocessing.ipynb, notebooks/02_bert_finetuning.ipynb, and notebooks/03_evaluation_and_analysis.ipynb with complete outputs, tables, and 13 inline rendered PNG plots
- Embed 13 diagnostic and comparison figures (bar charts, ROC curves, confusion matrices, label distribution) and benchmark leaderboards into README.md
- Embed markdown figure images into docs/04_analysis.md and recompile paper/CSE432_Bangla_Sentiment_BERT_Paper.md and docx with embedded images
- Add sentencepiece and protobuf dependencies to requirements.txt
- Update tools/notebooks sources with robust path resolution and precomputed checkpoint reloading
</commit_message>
<xml_diff>
--- a/paper/CSE432_Bangla_Sentiment_BERT_Paper.docx
+++ b/paper/CSE432_Bangla_Sentiment_BERT_Paper.docx
@@ -2,7 +2,7 @@
 <file path=word/document.xml><?xml version="1.0" encoding="utf-8"?>
 <w:document xmlns:w="http://schemas.openxmlformats.org/wordprocessingml/2006/main" xmlns:m="http://schemas.openxmlformats.org/officeDocument/2006/math" xmlns:r="http://schemas.openxmlformats.org/officeDocument/2006/relationships" xmlns:o="urn:schemas-microsoft-com:office:office" xmlns:v="urn:schemas-microsoft-com:vml" xmlns:w10="urn:schemas-microsoft-com:office:word" xmlns:a="http://schemas.openxmlformats.org/drawingml/2006/main" xmlns:pic="http://schemas.openxmlformats.org/drawingml/2006/picture" xmlns:wp="http://schemas.openxmlformats.org/drawingml/2006/wordprocessingDrawing">
   <w:body>
-    <w:bookmarkStart w:id="147" w:name="X2ee5368e90af5e8fdf8d6a5527f72c71c3c0126"/>
+    <w:bookmarkStart w:id="153" w:name="X2ee5368e90af5e8fdf8d6a5527f72c71c3c0126"/>
     <w:p>
       <w:pPr>
         <w:pStyle w:val="Heading1"/>
@@ -682,7 +682,7 @@
       </w:r>
     </w:p>
     <w:bookmarkEnd w:id="10"/>
-    <w:bookmarkStart w:id="105" w:name="how-to-run-the-code"/>
+    <w:bookmarkStart w:id="120" w:name="how-to-run-the-code"/>
     <w:p>
       <w:pPr>
         <w:pStyle w:val="Heading2"/>
@@ -11173,7 +11173,7 @@
       </w:r>
     </w:p>
     <w:bookmarkEnd w:id="61"/>
-    <w:bookmarkStart w:id="66" w:name="data-analysis"/>
+    <w:bookmarkStart w:id="69" w:name="data-analysis"/>
     <w:p>
       <w:pPr>
         <w:pStyle w:val="Heading3"/>
@@ -11639,7 +11639,7 @@
       </w:tr>
     </w:tbl>
     <w:bookmarkEnd w:id="62"/>
-    <w:bookmarkStart w:id="63" w:name="label-distribution-and-split-integrity"/>
+    <w:bookmarkStart w:id="66" w:name="label-distribution-and-split-integrity"/>
     <w:p>
       <w:pPr>
         <w:pStyle w:val="Heading4"/>
@@ -11658,6 +11658,61 @@
           <w:iCs/>
         </w:rPr>
         <w:t xml:space="preserve">Produced by Notebook 01 §4.2 and Notebook 03 §5.2.</w:t>
+      </w:r>
+    </w:p>
+    <w:p>
+      <w:pPr>
+        <w:pStyle w:val="CaptionedFigure"/>
+      </w:pPr>
+      <w:r>
+        <w:drawing>
+          <wp:inline>
+            <wp:extent cx="5334000" cy="3000375"/>
+            <wp:effectExtent b="0" l="0" r="0" t="0"/>
+            <wp:docPr descr="Figure 4.1: Label distribution across splits" title="" id="64" name="Picture"/>
+            <a:graphic>
+              <a:graphicData uri="http://schemas.openxmlformats.org/drawingml/2006/picture">
+                <pic:pic>
+                  <pic:nvPicPr>
+                    <pic:cNvPr descr="../results/label_distribution.png" id="65" name="Picture"/>
+                    <pic:cNvPicPr>
+                      <a:picLocks noChangeArrowheads="1" noChangeAspect="1"/>
+                    </pic:cNvPicPr>
+                  </pic:nvPicPr>
+                  <pic:blipFill>
+                    <a:blip r:embed="rId63"/>
+                    <a:stretch>
+                      <a:fillRect/>
+                    </a:stretch>
+                  </pic:blipFill>
+                  <pic:spPr bwMode="auto">
+                    <a:xfrm>
+                      <a:off x="0" y="0"/>
+                      <a:ext cx="5334000" cy="3000375"/>
+                    </a:xfrm>
+                    <a:prstGeom prst="rect">
+                      <a:avLst/>
+                    </a:prstGeom>
+                    <a:noFill/>
+                    <a:ln w="9525">
+                      <a:noFill/>
+                      <a:headEnd/>
+                      <a:tailEnd/>
+                    </a:ln>
+                  </pic:spPr>
+                </pic:pic>
+              </a:graphicData>
+            </a:graphic>
+          </wp:inline>
+        </w:drawing>
+      </w:r>
+    </w:p>
+    <w:p>
+      <w:pPr>
+        <w:pStyle w:val="ImageCaption"/>
+      </w:pPr>
+      <w:r>
+        <w:t xml:space="preserve">Figure 4.1: Label distribution across splits</w:t>
       </w:r>
     </w:p>
     <w:tbl>
@@ -11978,8 +12033,8 @@
         <w:t xml:space="preserve">(0 text overlap across all splits), guaranteeing clean generalization measurement.</w:t>
       </w:r>
     </w:p>
-    <w:bookmarkEnd w:id="63"/>
-    <w:bookmarkStart w:id="64" w:name="filtering-attrition"/>
+    <w:bookmarkEnd w:id="66"/>
+    <w:bookmarkStart w:id="67" w:name="filtering-attrition"/>
     <w:p>
       <w:pPr>
         <w:pStyle w:val="Heading4"/>
@@ -12325,8 +12380,8 @@
         <w:t xml:space="preserve">was composed of only ~20 distinct comments repeated thousands of times; deduplication correctly preserved genuine lexical diversity without synthetic inflation.</w:t>
       </w:r>
     </w:p>
-    <w:bookmarkEnd w:id="64"/>
-    <w:bookmarkStart w:id="65" w:name="text-length-distribution"/>
+    <w:bookmarkEnd w:id="67"/>
+    <w:bookmarkStart w:id="68" w:name="text-length-distribution"/>
     <w:p>
       <w:pPr>
         <w:pStyle w:val="Heading4"/>
@@ -12557,9 +12612,9 @@
         </w:pict>
       </w:r>
     </w:p>
-    <w:bookmarkEnd w:id="65"/>
-    <w:bookmarkEnd w:id="66"/>
-    <w:bookmarkStart w:id="70" w:name="grammar-rule-mining-analysis-banglagec"/>
+    <w:bookmarkEnd w:id="68"/>
+    <w:bookmarkEnd w:id="69"/>
+    <w:bookmarkStart w:id="73" w:name="grammar-rule-mining-analysis-banglagec"/>
     <w:p>
       <w:pPr>
         <w:pStyle w:val="Heading3"/>
@@ -12580,7 +12635,7 @@
         <w:t xml:space="preserve">Produced by Notebook 01 §5.1.</w:t>
       </w:r>
     </w:p>
-    <w:bookmarkStart w:id="67" w:name="rule-yield"/>
+    <w:bookmarkStart w:id="70" w:name="rule-yield"/>
     <w:p>
       <w:pPr>
         <w:pStyle w:val="Heading4"/>
@@ -12771,8 +12826,8 @@
         </w:tc>
       </w:tr>
     </w:tbl>
-    <w:bookmarkEnd w:id="67"/>
-    <w:bookmarkStart w:id="68" w:name="rule-type-distribution"/>
+    <w:bookmarkEnd w:id="70"/>
+    <w:bookmarkStart w:id="71" w:name="rule-type-distribution"/>
     <w:p>
       <w:pPr>
         <w:pStyle w:val="Heading4"/>
@@ -13230,8 +13285,8 @@
         <w:t xml:space="preserve">and report why.</w:t>
       </w:r>
     </w:p>
-    <w:bookmarkEnd w:id="68"/>
-    <w:bookmarkStart w:id="69" w:name="ablation-does-the-rule-table-help"/>
+    <w:bookmarkEnd w:id="71"/>
+    <w:bookmarkStart w:id="72" w:name="ablation-does-the-rule-table-help"/>
     <w:p>
       <w:pPr>
         <w:pStyle w:val="Heading4"/>
@@ -13545,9 +13600,9 @@
         </w:pict>
       </w:r>
     </w:p>
-    <w:bookmarkEnd w:id="69"/>
-    <w:bookmarkEnd w:id="70"/>
-    <w:bookmarkStart w:id="71" w:name="lexicon-analysis-bangla-nlp-words"/>
+    <w:bookmarkEnd w:id="72"/>
+    <w:bookmarkEnd w:id="73"/>
+    <w:bookmarkStart w:id="74" w:name="lexicon-analysis-bangla-nlp-words"/>
     <w:p>
       <w:pPr>
         <w:pStyle w:val="Heading3"/>
@@ -13807,8 +13862,8 @@
         </w:pict>
       </w:r>
     </w:p>
-    <w:bookmarkEnd w:id="71"/>
-    <w:bookmarkStart w:id="73" w:name="X5bd696abf335b486e43852f874abe7738213260"/>
+    <w:bookmarkEnd w:id="74"/>
+    <w:bookmarkStart w:id="76" w:name="X5bd696abf335b486e43852f874abe7738213260"/>
     <w:p>
       <w:pPr>
         <w:pStyle w:val="Heading3"/>
@@ -13994,7 +14049,7 @@
         </w:tc>
       </w:tr>
     </w:tbl>
-    <w:bookmarkStart w:id="72" w:name="top-matched-tasks"/>
+    <w:bookmarkStart w:id="75" w:name="top-matched-tasks"/>
     <w:p>
       <w:pPr>
         <w:pStyle w:val="Heading4"/>
@@ -14372,9 +14427,9 @@
         </w:pict>
       </w:r>
     </w:p>
-    <w:bookmarkEnd w:id="72"/>
-    <w:bookmarkEnd w:id="73"/>
-    <w:bookmarkStart w:id="77" w:name="model-performance-analysis"/>
+    <w:bookmarkEnd w:id="75"/>
+    <w:bookmarkEnd w:id="76"/>
+    <w:bookmarkStart w:id="80" w:name="model-performance-analysis"/>
     <w:p>
       <w:pPr>
         <w:pStyle w:val="Heading3"/>
@@ -14383,7 +14438,7 @@
         <w:t xml:space="preserve">4.5 Model Performance Analysis</w:t>
       </w:r>
     </w:p>
-    <w:bookmarkStart w:id="74" w:name="overall-results"/>
+    <w:bookmarkStart w:id="77" w:name="overall-results"/>
     <w:p>
       <w:pPr>
         <w:pStyle w:val="Heading4"/>
@@ -15198,8 +15253,8 @@
         <w:t xml:space="preserve">), confirming strong correlation well above chance while appropriately penalizing imbalanced error modes.</w:t>
       </w:r>
     </w:p>
-    <w:bookmarkEnd w:id="74"/>
-    <w:bookmarkStart w:id="75" w:name="per-class-breakdown"/>
+    <w:bookmarkEnd w:id="77"/>
+    <w:bookmarkStart w:id="78" w:name="per-class-breakdown"/>
     <w:p>
       <w:pPr>
         <w:pStyle w:val="Heading4"/>
@@ -16091,8 +16146,8 @@
         <w:t xml:space="preserve">), confirming that critical customer complaints are reliably detected. As expected, neutral F1 is the lowest (0.0761 to 0.1429), as neutral reviews (rating = 3) are ambiguous and frequently absorbed into positive classifications.</w:t>
       </w:r>
     </w:p>
-    <w:bookmarkEnd w:id="75"/>
-    <w:bookmarkStart w:id="76" w:name="binary-2-class-results"/>
+    <w:bookmarkEnd w:id="78"/>
+    <w:bookmarkStart w:id="79" w:name="binary-2-class-results"/>
     <w:p>
       <w:pPr>
         <w:pStyle w:val="Heading4"/>
@@ -16448,9 +16503,9 @@
         </w:pict>
       </w:r>
     </w:p>
-    <w:bookmarkEnd w:id="76"/>
-    <w:bookmarkEnd w:id="77"/>
-    <w:bookmarkStart w:id="78" w:name="Xe8d096db4db477fd9f9f2b9b1bf968b2b593dff"/>
+    <w:bookmarkEnd w:id="79"/>
+    <w:bookmarkEnd w:id="80"/>
+    <w:bookmarkStart w:id="87" w:name="Xe8d096db4db477fd9f9f2b9b1bf968b2b593dff"/>
     <w:p>
       <w:pPr>
         <w:pStyle w:val="Heading3"/>
@@ -16804,6 +16859,116 @@
     </w:p>
     <w:p>
       <w:pPr>
+        <w:pStyle w:val="CaptionedFigure"/>
+      </w:pPr>
+      <w:r>
+        <w:drawing>
+          <wp:inline>
+            <wp:extent cx="5334000" cy="2963333"/>
+            <wp:effectExtent b="0" l="0" r="0" t="0"/>
+            <wp:docPr descr="Figure 4.2: Macro-F1 comparison across models" title="" id="82" name="Picture"/>
+            <a:graphic>
+              <a:graphicData uri="http://schemas.openxmlformats.org/drawingml/2006/picture">
+                <pic:pic>
+                  <pic:nvPicPr>
+                    <pic:cNvPr descr="../results/bar_macro_f1.png" id="83" name="Picture"/>
+                    <pic:cNvPicPr>
+                      <a:picLocks noChangeArrowheads="1" noChangeAspect="1"/>
+                    </pic:cNvPicPr>
+                  </pic:nvPicPr>
+                  <pic:blipFill>
+                    <a:blip r:embed="rId81"/>
+                    <a:stretch>
+                      <a:fillRect/>
+                    </a:stretch>
+                  </pic:blipFill>
+                  <pic:spPr bwMode="auto">
+                    <a:xfrm>
+                      <a:off x="0" y="0"/>
+                      <a:ext cx="5334000" cy="2963333"/>
+                    </a:xfrm>
+                    <a:prstGeom prst="rect">
+                      <a:avLst/>
+                    </a:prstGeom>
+                    <a:noFill/>
+                    <a:ln w="9525">
+                      <a:noFill/>
+                      <a:headEnd/>
+                      <a:tailEnd/>
+                    </a:ln>
+                  </pic:spPr>
+                </pic:pic>
+              </a:graphicData>
+            </a:graphic>
+          </wp:inline>
+        </w:drawing>
+      </w:r>
+    </w:p>
+    <w:p>
+      <w:pPr>
+        <w:pStyle w:val="ImageCaption"/>
+      </w:pPr>
+      <w:r>
+        <w:t xml:space="preserve">Figure 4.2: Macro-F1 comparison across models</w:t>
+      </w:r>
+    </w:p>
+    <w:p>
+      <w:pPr>
+        <w:pStyle w:val="CaptionedFigure"/>
+      </w:pPr>
+      <w:r>
+        <w:drawing>
+          <wp:inline>
+            <wp:extent cx="5334000" cy="2963333"/>
+            <wp:effectExtent b="0" l="0" r="0" t="0"/>
+            <wp:docPr descr="Figure 4.3: Accuracy comparison across models" title="" id="85" name="Picture"/>
+            <a:graphic>
+              <a:graphicData uri="http://schemas.openxmlformats.org/drawingml/2006/picture">
+                <pic:pic>
+                  <pic:nvPicPr>
+                    <pic:cNvPr descr="../results/bar_accuracy.png" id="86" name="Picture"/>
+                    <pic:cNvPicPr>
+                      <a:picLocks noChangeArrowheads="1" noChangeAspect="1"/>
+                    </pic:cNvPicPr>
+                  </pic:nvPicPr>
+                  <pic:blipFill>
+                    <a:blip r:embed="rId84"/>
+                    <a:stretch>
+                      <a:fillRect/>
+                    </a:stretch>
+                  </pic:blipFill>
+                  <pic:spPr bwMode="auto">
+                    <a:xfrm>
+                      <a:off x="0" y="0"/>
+                      <a:ext cx="5334000" cy="2963333"/>
+                    </a:xfrm>
+                    <a:prstGeom prst="rect">
+                      <a:avLst/>
+                    </a:prstGeom>
+                    <a:noFill/>
+                    <a:ln w="9525">
+                      <a:noFill/>
+                      <a:headEnd/>
+                      <a:tailEnd/>
+                    </a:ln>
+                  </pic:spPr>
+                </pic:pic>
+              </a:graphicData>
+            </a:graphic>
+          </wp:inline>
+        </w:drawing>
+      </w:r>
+    </w:p>
+    <w:p>
+      <w:pPr>
+        <w:pStyle w:val="ImageCaption"/>
+      </w:pPr>
+      <w:r>
+        <w:t xml:space="preserve">Figure 4.3: Accuracy comparison across models</w:t>
+      </w:r>
+    </w:p>
+    <w:p>
+      <w:pPr>
         <w:pStyle w:val="BodyText"/>
       </w:pPr>
       <w:r>
@@ -16951,8 +17116,8 @@
         </w:pict>
       </w:r>
     </w:p>
-    <w:bookmarkEnd w:id="78"/>
-    <w:bookmarkStart w:id="82" w:name="slice-analysis"/>
+    <w:bookmarkEnd w:id="87"/>
+    <w:bookmarkStart w:id="91" w:name="slice-analysis"/>
     <w:p>
       <w:pPr>
         <w:pStyle w:val="Heading3"/>
@@ -16961,7 +17126,7 @@
         <w:t xml:space="preserve">4.7 Slice Analysis</w:t>
       </w:r>
     </w:p>
-    <w:bookmarkStart w:id="79" w:name="accuracy-by-source-platform"/>
+    <w:bookmarkStart w:id="88" w:name="accuracy-by-source-platform"/>
     <w:p>
       <w:pPr>
         <w:pStyle w:val="Heading4"/>
@@ -17264,8 +17429,8 @@
         <w:t xml:space="preserve">The spread of 17.26% highlights significant domain disparity: curated e-commerce comments in RevBangla achieve &gt;90% accuracy, whereas colloquial customer reviews on Daraz suffer from noisy ratings, dialect variation, and code-mixing.</w:t>
       </w:r>
     </w:p>
-    <w:bookmarkEnd w:id="79"/>
-    <w:bookmarkStart w:id="80" w:name="accuracy-by-negation-presence"/>
+    <w:bookmarkEnd w:id="88"/>
+    <w:bookmarkStart w:id="89" w:name="accuracy-by-negation-presence"/>
     <w:p>
       <w:pPr>
         <w:pStyle w:val="Heading4"/>
@@ -17662,8 +17827,8 @@
         <w:t xml:space="preserve">), meaning the forward tagging window captured only a portion of negation scopes. A backward negation window is recommended as a priority improvement.</w:t>
       </w:r>
     </w:p>
-    <w:bookmarkEnd w:id="80"/>
-    <w:bookmarkStart w:id="81" w:name="accuracy-by-comment-length"/>
+    <w:bookmarkEnd w:id="89"/>
+    <w:bookmarkStart w:id="90" w:name="accuracy-by-comment-length"/>
     <w:p>
       <w:pPr>
         <w:pStyle w:val="Heading4"/>
@@ -18011,9 +18176,9 @@
         </w:pict>
       </w:r>
     </w:p>
-    <w:bookmarkEnd w:id="81"/>
-    <w:bookmarkEnd w:id="82"/>
-    <w:bookmarkStart w:id="86" w:name="error-analysis-1"/>
+    <w:bookmarkEnd w:id="90"/>
+    <w:bookmarkEnd w:id="91"/>
+    <w:bookmarkStart w:id="101" w:name="error-analysis-1"/>
     <w:p>
       <w:pPr>
         <w:pStyle w:val="Heading3"/>
@@ -18056,7 +18221,7 @@
         <w:t xml:space="preserve">.</w:t>
       </w:r>
     </w:p>
-    <w:bookmarkStart w:id="83" w:name="confusion-matrix"/>
+    <w:bookmarkStart w:id="95" w:name="confusion-matrix"/>
     <w:p>
       <w:pPr>
         <w:pStyle w:val="Heading4"/>
@@ -18067,43 +18232,57 @@
     </w:p>
     <w:p>
       <w:pPr>
-        <w:pStyle w:val="FirstParagraph"/>
-      </w:pPr>
-      <w:r>
-        <w:rPr>
-          <w:i/>
-          <w:iCs/>
-        </w:rPr>
-        <w:t xml:space="preserve">Figure:</w:t>
-      </w:r>
-      <w:r>
-        <w:rPr>
-          <w:i/>
-          <w:iCs/>
-        </w:rPr>
-        <w:t xml:space="preserve"> </w:t>
-      </w:r>
-      <w:r>
-        <w:rPr>
-          <w:rStyle w:val="VerbatimChar"/>
-          <w:i/>
-          <w:iCs/>
-        </w:rPr>
-        <w:t xml:space="preserve">results/confusion_banglabert.png</w:t>
-      </w:r>
-      <w:r>
-        <w:rPr>
-          <w:i/>
-          <w:iCs/>
-        </w:rPr>
-        <w:t xml:space="preserve"> </w:t>
-      </w:r>
-      <w:r>
-        <w:rPr>
-          <w:i/>
-          <w:iCs/>
-        </w:rPr>
-        <w:t xml:space="preserve">— counts and row-normalised side by side.</w:t>
+        <w:pStyle w:val="CaptionedFigure"/>
+      </w:pPr>
+      <w:r>
+        <w:drawing>
+          <wp:inline>
+            <wp:extent cx="5334000" cy="2222499"/>
+            <wp:effectExtent b="0" l="0" r="0" t="0"/>
+            <wp:docPr descr="Figure 4.4: BanglaBERT Confusion Matrix (Counts and Row-Normalised)" title="" id="93" name="Picture"/>
+            <a:graphic>
+              <a:graphicData uri="http://schemas.openxmlformats.org/drawingml/2006/picture">
+                <pic:pic>
+                  <pic:nvPicPr>
+                    <pic:cNvPr descr="../results/confusion_banglabert.png" id="94" name="Picture"/>
+                    <pic:cNvPicPr>
+                      <a:picLocks noChangeArrowheads="1" noChangeAspect="1"/>
+                    </pic:cNvPicPr>
+                  </pic:nvPicPr>
+                  <pic:blipFill>
+                    <a:blip r:embed="rId92"/>
+                    <a:stretch>
+                      <a:fillRect/>
+                    </a:stretch>
+                  </pic:blipFill>
+                  <pic:spPr bwMode="auto">
+                    <a:xfrm>
+                      <a:off x="0" y="0"/>
+                      <a:ext cx="5334000" cy="2222499"/>
+                    </a:xfrm>
+                    <a:prstGeom prst="rect">
+                      <a:avLst/>
+                    </a:prstGeom>
+                    <a:noFill/>
+                    <a:ln w="9525">
+                      <a:noFill/>
+                      <a:headEnd/>
+                      <a:tailEnd/>
+                    </a:ln>
+                  </pic:spPr>
+                </pic:pic>
+              </a:graphicData>
+            </a:graphic>
+          </wp:inline>
+        </w:drawing>
+      </w:r>
+    </w:p>
+    <w:p>
+      <w:pPr>
+        <w:pStyle w:val="ImageCaption"/>
+      </w:pPr>
+      <w:r>
+        <w:t xml:space="preserve">Figure 4.4: BanglaBERT Confusion Matrix (Counts and Row-Normalised)</w:t>
       </w:r>
     </w:p>
     <w:tbl>
@@ -18444,8 +18623,8 @@
         <w:t xml:space="preserve">matrix, not the raw counts. Raw counts are dominated by class size and will always make the majority class look worst.</w:t>
       </w:r>
     </w:p>
-    <w:bookmarkEnd w:id="83"/>
-    <w:bookmarkStart w:id="84" w:name="qualitative-error-themes"/>
+    <w:bookmarkEnd w:id="95"/>
+    <w:bookmarkStart w:id="96" w:name="qualitative-error-themes"/>
     <w:p>
       <w:pPr>
         <w:pStyle w:val="Heading4"/>
@@ -18774,8 +18953,8 @@
         <w:t xml:space="preserve">In the examined error sample, 35–40% of apparent model errors stem from star-rating label noise (e.g. buyers writing scathing reviews while submitting 5-star ratings on Daraz). The model’s negative prediction in these cases was linguistically accurate, showing that label smoothing (0.05) is crucial for regularisation.</w:t>
       </w:r>
     </w:p>
-    <w:bookmarkEnd w:id="84"/>
-    <w:bookmarkStart w:id="85" w:name="roc-analysis"/>
+    <w:bookmarkEnd w:id="96"/>
+    <w:bookmarkStart w:id="100" w:name="roc-analysis"/>
     <w:p>
       <w:pPr>
         <w:pStyle w:val="Heading4"/>
@@ -18786,43 +18965,57 @@
     </w:p>
     <w:p>
       <w:pPr>
-        <w:pStyle w:val="FirstParagraph"/>
-      </w:pPr>
-      <w:r>
-        <w:rPr>
-          <w:i/>
-          <w:iCs/>
-        </w:rPr>
-        <w:t xml:space="preserve">Figure:</w:t>
-      </w:r>
-      <w:r>
-        <w:rPr>
-          <w:i/>
-          <w:iCs/>
-        </w:rPr>
-        <w:t xml:space="preserve"> </w:t>
-      </w:r>
-      <w:r>
-        <w:rPr>
-          <w:rStyle w:val="VerbatimChar"/>
-          <w:i/>
-          <w:iCs/>
-        </w:rPr>
-        <w:t xml:space="preserve">results/roc_banglabert.png</w:t>
-      </w:r>
-      <w:r>
-        <w:rPr>
-          <w:i/>
-          <w:iCs/>
-        </w:rPr>
-        <w:t xml:space="preserve"> </w:t>
-      </w:r>
-      <w:r>
-        <w:rPr>
-          <w:i/>
-          <w:iCs/>
-        </w:rPr>
-        <w:t xml:space="preserve">— one-vs-rest curves with per-class AUC.</w:t>
+        <w:pStyle w:val="CaptionedFigure"/>
+      </w:pPr>
+      <w:r>
+        <w:drawing>
+          <wp:inline>
+            <wp:extent cx="5334000" cy="3809999"/>
+            <wp:effectExtent b="0" l="0" r="0" t="0"/>
+            <wp:docPr descr="Figure 4.5: BanglaBERT One-vs-Rest ROC Curves with Per-Class AUC" title="" id="98" name="Picture"/>
+            <a:graphic>
+              <a:graphicData uri="http://schemas.openxmlformats.org/drawingml/2006/picture">
+                <pic:pic>
+                  <pic:nvPicPr>
+                    <pic:cNvPr descr="../results/roc_banglabert.png" id="99" name="Picture"/>
+                    <pic:cNvPicPr>
+                      <a:picLocks noChangeArrowheads="1" noChangeAspect="1"/>
+                    </pic:cNvPicPr>
+                  </pic:nvPicPr>
+                  <pic:blipFill>
+                    <a:blip r:embed="rId97"/>
+                    <a:stretch>
+                      <a:fillRect/>
+                    </a:stretch>
+                  </pic:blipFill>
+                  <pic:spPr bwMode="auto">
+                    <a:xfrm>
+                      <a:off x="0" y="0"/>
+                      <a:ext cx="5334000" cy="3809999"/>
+                    </a:xfrm>
+                    <a:prstGeom prst="rect">
+                      <a:avLst/>
+                    </a:prstGeom>
+                    <a:noFill/>
+                    <a:ln w="9525">
+                      <a:noFill/>
+                      <a:headEnd/>
+                      <a:tailEnd/>
+                    </a:ln>
+                  </pic:spPr>
+                </pic:pic>
+              </a:graphicData>
+            </a:graphic>
+          </wp:inline>
+        </w:drawing>
+      </w:r>
+    </w:p>
+    <w:p>
+      <w:pPr>
+        <w:pStyle w:val="ImageCaption"/>
+      </w:pPr>
+      <w:r>
+        <w:t xml:space="preserve">Figure 4.5: BanglaBERT One-vs-Rest ROC Curves with Per-Class AUC</w:t>
       </w:r>
     </w:p>
     <w:tbl>
@@ -19054,9 +19247,9 @@
         </w:pict>
       </w:r>
     </w:p>
-    <w:bookmarkEnd w:id="85"/>
-    <w:bookmarkEnd w:id="86"/>
-    <w:bookmarkStart w:id="87" w:name="reproducibility-record"/>
+    <w:bookmarkEnd w:id="100"/>
+    <w:bookmarkEnd w:id="101"/>
+    <w:bookmarkStart w:id="102" w:name="reproducibility-record"/>
     <w:p>
       <w:pPr>
         <w:pStyle w:val="Heading3"/>
@@ -19586,8 +19779,8 @@
         </w:pict>
       </w:r>
     </w:p>
-    <w:bookmarkEnd w:id="87"/>
-    <w:bookmarkStart w:id="88" w:name="threats-to-validity"/>
+    <w:bookmarkEnd w:id="102"/>
+    <w:bookmarkStart w:id="103" w:name="threats-to-validity"/>
     <w:p>
       <w:pPr>
         <w:pStyle w:val="Heading3"/>
@@ -20098,8 +20291,8 @@
         </w:pict>
       </w:r>
     </w:p>
-    <w:bookmarkEnd w:id="88"/>
-    <w:bookmarkStart w:id="89" w:name="summary-of-required-runs"/>
+    <w:bookmarkEnd w:id="103"/>
+    <w:bookmarkStart w:id="104" w:name="summary-of-required-runs"/>
     <w:p>
       <w:pPr>
         <w:pStyle w:val="Heading3"/>
@@ -20369,8 +20562,8 @@
         </w:pict>
       </w:r>
     </w:p>
-    <w:bookmarkEnd w:id="89"/>
-    <w:bookmarkStart w:id="94" w:name="work-completed"/>
+    <w:bookmarkEnd w:id="104"/>
+    <w:bookmarkStart w:id="109" w:name="work-completed"/>
     <w:p>
       <w:pPr>
         <w:pStyle w:val="Heading3"/>
@@ -20387,7 +20580,7 @@
         <w:t xml:space="preserve">This project set out to build a Bangla sentiment analysis system on fine-tuned BERT models. Four things were delivered:</w:t>
       </w:r>
     </w:p>
-    <w:bookmarkStart w:id="90" w:name="a-reproducible-preprocessing-pipeline"/>
+    <w:bookmarkStart w:id="105" w:name="a-reproducible-preprocessing-pipeline"/>
     <w:p>
       <w:pPr>
         <w:pStyle w:val="Heading4"/>
@@ -20455,8 +20648,8 @@
         <w:t xml:space="preserve">) have pure-Python fallbacks, and an unresolvable source is skipped with a warning rather than aborting the run. This matters practically — Kaggle dataset schemas change without notice, and a pipeline that crashes on one upstream rename is not reproducible in any meaningful sense.</w:t>
       </w:r>
     </w:p>
-    <w:bookmarkEnd w:id="90"/>
-    <w:bookmarkStart w:id="91" w:name="X7e43f433f25a9d875977eaefdd956414f9624f9"/>
+    <w:bookmarkEnd w:id="105"/>
+    <w:bookmarkStart w:id="106" w:name="X7e43f433f25a9d875977eaefdd956414f9624f9"/>
     <w:p>
       <w:pPr>
         <w:pStyle w:val="Heading4"/>
@@ -20691,8 +20884,8 @@
         <w:t xml:space="preserve">The catalog use is the most novel of the three. Generating the literature review from a machine-readable index removes cherry-picking from the survey: the filter regex and the catalog version are both recorded, so the selection of prior work is auditable.</w:t>
       </w:r>
     </w:p>
-    <w:bookmarkEnd w:id="91"/>
-    <w:bookmarkStart w:id="92" w:name="a-fair-multi-model-comparison-harness"/>
+    <w:bookmarkEnd w:id="106"/>
+    <w:bookmarkStart w:id="107" w:name="a-fair-multi-model-comparison-harness"/>
     <w:p>
       <w:pPr>
         <w:pStyle w:val="Heading4"/>
@@ -20836,8 +21029,8 @@
         <w:t xml:space="preserve">— star-rating-derived labels are noisy proxies for human judgement.</w:t>
       </w:r>
     </w:p>
-    <w:bookmarkEnd w:id="92"/>
-    <w:bookmarkStart w:id="93" w:name="X5112dd8f593b3d81dacd288c7efddbcec3885ef"/>
+    <w:bookmarkEnd w:id="107"/>
+    <w:bookmarkStart w:id="108" w:name="X5112dd8f593b3d81dacd288c7efddbcec3885ef"/>
     <w:p>
       <w:pPr>
         <w:pStyle w:val="Heading4"/>
@@ -20965,9 +21158,9 @@
         </w:pict>
       </w:r>
     </w:p>
-    <w:bookmarkEnd w:id="93"/>
-    <w:bookmarkEnd w:id="94"/>
-    <w:bookmarkStart w:id="101" w:name="findings"/>
+    <w:bookmarkEnd w:id="108"/>
+    <w:bookmarkEnd w:id="109"/>
+    <w:bookmarkStart w:id="116" w:name="findings"/>
     <w:p>
       <w:pPr>
         <w:pStyle w:val="Heading3"/>
@@ -20976,7 +21169,7 @@
         <w:t xml:space="preserve">5.2 Findings</w:t>
       </w:r>
     </w:p>
-    <w:bookmarkStart w:id="95" w:name="X301d03ea537db25d902ad0db8c475bcbc4e556c"/>
+    <w:bookmarkStart w:id="110" w:name="X301d03ea537db25d902ad0db8c475bcbc4e556c"/>
     <w:p>
       <w:pPr>
         <w:pStyle w:val="Heading4"/>
@@ -21308,8 +21501,8 @@
         <w:t xml:space="preserve">with 0.5760 macro-F1) by +0.0222 macro-F1 (+2.22 percentage points). Pretraining directly on Bangla/Banglish text yields representations that capture dialectal semantics and morphological structures superior to generic multilingual models.</w:t>
       </w:r>
     </w:p>
-    <w:bookmarkEnd w:id="95"/>
-    <w:bookmarkStart w:id="96" w:name="X6d20584dbf562fb6b65e5a9ae62a97b02d593f2"/>
+    <w:bookmarkEnd w:id="110"/>
+    <w:bookmarkStart w:id="111" w:name="X6d20584dbf562fb6b65e5a9ae62a97b02d593f2"/>
     <w:p>
       <w:pPr>
         <w:pStyle w:val="Heading4"/>
@@ -21473,8 +21666,8 @@
         <w:t xml:space="preserve">) outperforms the best 1-epoch transformer by 2.76 percentage points in macro-F1 (0.6341 vs. 0.6065) and in accuracy (0.8854 vs. 0.8278). Subword character n-grams (2–5 characters) paired with class-weighted logistic regression excel on noisy, orthographically irregular Bangla reviews without overfitting, setting a competitive performance ceiling that transformers require substantial hyperparameter tuning and multi-epoch compute to match.</w:t>
       </w:r>
     </w:p>
-    <w:bookmarkEnd w:id="96"/>
-    <w:bookmarkStart w:id="97" w:name="did-banglagec-contribute"/>
+    <w:bookmarkEnd w:id="111"/>
+    <w:bookmarkStart w:id="112" w:name="did-banglagec-contribute"/>
     <w:p>
       <w:pPr>
         <w:pStyle w:val="Heading4"/>
@@ -21605,8 +21798,8 @@
         <w:t xml:space="preserve">The ablation reveals a negative delta (−0.0243 Macro-F1, −0.0334 Accuracy). Normalizing informal Bangla words through parallel GEC substitution rules tends to smooth away colloquial and emphatic dialect forms that carry strong sentiment signals in user reviews. While BanglaGEC successfully provides a 96,383-token well-formed vocabulary and an auditable linguistic baseline, unconstrained grammatical normalization should be applied judiciously in sentiment tasks to avoid eroding affective nuance.</w:t>
       </w:r>
     </w:p>
-    <w:bookmarkEnd w:id="97"/>
-    <w:bookmarkStart w:id="98" w:name="did-negation-scope-tagging-help"/>
+    <w:bookmarkEnd w:id="112"/>
+    <w:bookmarkStart w:id="113" w:name="did-negation-scope-tagging-help"/>
     <w:p>
       <w:pPr>
         <w:pStyle w:val="Heading4"/>
@@ -21794,8 +21987,8 @@
         <w:t xml:space="preserve">The test set contains 13.40% negation-tagged rows (186 rows), well above the 5% statistical power floor. Both BanglaBERT and the TF-IDF baseline exhibit a noticeable negation deficit (~15–20%), reflecting the difficulty of polarity inversion in colloquial Bangla review text. Because Bangla primarily places the negator after the verb, moving to a backward negation window represents a clear future improvement.</w:t>
       </w:r>
     </w:p>
-    <w:bookmarkEnd w:id="98"/>
-    <w:bookmarkStart w:id="99" w:name="generalisation-across-platforms"/>
+    <w:bookmarkEnd w:id="113"/>
+    <w:bookmarkStart w:id="114" w:name="generalisation-across-platforms"/>
     <w:p>
       <w:pPr>
         <w:pStyle w:val="Heading4"/>
@@ -21944,8 +22137,8 @@
         <w:t xml:space="preserve">The 17.26% cross-platform spread reflects the noisy star ratings and code-mixing present in the Daraz reviews relative to the cleaner curated text in RevBangla.</w:t>
       </w:r>
     </w:p>
-    <w:bookmarkEnd w:id="99"/>
-    <w:bookmarkStart w:id="100" w:name="dominant-error-mode"/>
+    <w:bookmarkEnd w:id="114"/>
+    <w:bookmarkStart w:id="115" w:name="dominant-error-mode"/>
     <w:p>
       <w:pPr>
         <w:pStyle w:val="Heading4"/>
@@ -22117,9 +22310,9 @@
         </w:pict>
       </w:r>
     </w:p>
-    <w:bookmarkEnd w:id="100"/>
-    <w:bookmarkEnd w:id="101"/>
-    <w:bookmarkStart w:id="102" w:name="limitations"/>
+    <w:bookmarkEnd w:id="115"/>
+    <w:bookmarkEnd w:id="116"/>
+    <w:bookmarkStart w:id="117" w:name="limitations"/>
     <w:p>
       <w:pPr>
         <w:pStyle w:val="Heading3"/>
@@ -22364,8 +22557,8 @@
         </w:pict>
       </w:r>
     </w:p>
-    <w:bookmarkEnd w:id="102"/>
-    <w:bookmarkStart w:id="103" w:name="future-work"/>
+    <w:bookmarkEnd w:id="117"/>
+    <w:bookmarkStart w:id="118" w:name="future-work"/>
     <w:p>
       <w:pPr>
         <w:pStyle w:val="Heading3"/>
@@ -22906,8 +23099,8 @@
         </w:pict>
       </w:r>
     </w:p>
-    <w:bookmarkEnd w:id="103"/>
-    <w:bookmarkStart w:id="104" w:name="closing-remark"/>
+    <w:bookmarkEnd w:id="118"/>
+    <w:bookmarkStart w:id="119" w:name="closing-remark"/>
     <w:p>
       <w:pPr>
         <w:pStyle w:val="Heading3"/>
@@ -23056,9 +23249,9 @@
         </w:pict>
       </w:r>
     </w:p>
-    <w:bookmarkEnd w:id="104"/>
-    <w:bookmarkEnd w:id="105"/>
-    <w:bookmarkStart w:id="142" w:name="X32da77d8b8ff5bc7e908ac842c0ecce1cc371b0"/>
+    <w:bookmarkEnd w:id="119"/>
+    <w:bookmarkEnd w:id="120"/>
+    <w:bookmarkStart w:id="148" w:name="X32da77d8b8ff5bc7e908ac842c0ecce1cc371b0"/>
     <w:p>
       <w:pPr>
         <w:pStyle w:val="Heading2"/>
@@ -23096,7 +23289,7 @@
         <w:t xml:space="preserve">. Regenerate before submission.</w:t>
       </w:r>
     </w:p>
-    <w:bookmarkStart w:id="141" w:name="Xdb321718ba9f2125c82b04e87ae7e5bb56d080f"/>
+    <w:bookmarkStart w:id="147" w:name="Xdb321718ba9f2125c82b04e87ae7e5bb56d080f"/>
     <w:p>
       <w:pPr>
         <w:pStyle w:val="Heading4"/>
@@ -23120,7 +23313,7 @@
         <w:t xml:space="preserve">(166 matched entries)</w:t>
       </w:r>
     </w:p>
-    <w:bookmarkStart w:id="120" w:name="dataset-14"/>
+    <w:bookmarkStart w:id="131" w:name="dataset-14"/>
     <w:p>
       <w:pPr>
         <w:pStyle w:val="Heading5"/>
@@ -23254,7 +23447,7 @@
             <w:pPr>
               <w:pStyle w:val="Compact"/>
             </w:pPr>
-            <w:hyperlink r:id="rId106">
+            <w:hyperlink r:id="rId121">
               <w:r>
                 <w:rPr>
                   <w:rStyle w:val="Hyperlink"/>
@@ -23316,7 +23509,7 @@
             <w:pPr>
               <w:pStyle w:val="Compact"/>
             </w:pPr>
-            <w:hyperlink r:id="rId107">
+            <w:hyperlink r:id="rId122">
               <w:r>
                 <w:rPr>
                   <w:rStyle w:val="Hyperlink"/>
@@ -23378,7 +23571,7 @@
             <w:pPr>
               <w:pStyle w:val="Compact"/>
             </w:pPr>
-            <w:hyperlink r:id="rId108">
+            <w:hyperlink r:id="rId123">
               <w:r>
                 <w:rPr>
                   <w:rStyle w:val="Hyperlink"/>
@@ -23440,7 +23633,7 @@
             <w:pPr>
               <w:pStyle w:val="Compact"/>
             </w:pPr>
-            <w:hyperlink r:id="rId109">
+            <w:hyperlink r:id="rId124">
               <w:r>
                 <w:rPr>
                   <w:rStyle w:val="Hyperlink"/>
@@ -23502,7 +23695,7 @@
             <w:pPr>
               <w:pStyle w:val="Compact"/>
             </w:pPr>
-            <w:hyperlink r:id="rId110">
+            <w:hyperlink r:id="rId125">
               <w:r>
                 <w:rPr>
                   <w:rStyle w:val="Hyperlink"/>
@@ -23564,7 +23757,7 @@
             <w:pPr>
               <w:pStyle w:val="Compact"/>
             </w:pPr>
-            <w:hyperlink r:id="rId111">
+            <w:hyperlink r:id="rId126">
               <w:r>
                 <w:rPr>
                   <w:rStyle w:val="Hyperlink"/>
@@ -23626,7 +23819,7 @@
             <w:pPr>
               <w:pStyle w:val="Compact"/>
             </w:pPr>
-            <w:hyperlink r:id="rId112">
+            <w:hyperlink r:id="rId127">
               <w:r>
                 <w:rPr>
                   <w:rStyle w:val="Hyperlink"/>
@@ -23688,7 +23881,7 @@
             <w:pPr>
               <w:pStyle w:val="Compact"/>
             </w:pPr>
-            <w:hyperlink r:id="rId113">
+            <w:hyperlink r:id="rId128">
               <w:r>
                 <w:rPr>
                   <w:rStyle w:val="Hyperlink"/>
@@ -23750,7 +23943,7 @@
             <w:pPr>
               <w:pStyle w:val="Compact"/>
             </w:pPr>
-            <w:hyperlink r:id="rId114">
+            <w:hyperlink r:id="rId129">
               <w:r>
                 <w:rPr>
                   <w:rStyle w:val="Hyperlink"/>
@@ -23812,7 +24005,7 @@
             <w:pPr>
               <w:pStyle w:val="Compact"/>
             </w:pPr>
-            <w:hyperlink r:id="rId115">
+            <w:hyperlink r:id="rId130">
               <w:r>
                 <w:rPr>
                   <w:rStyle w:val="Hyperlink"/>
@@ -23823,257 +24016,9 @@
           </w:p>
         </w:tc>
       </w:tr>
-      <w:tr>
-        <w:tc>
-          <w:tcPr/>
-          <w:p>
-            <w:pPr>
-              <w:pStyle w:val="Compact"/>
-            </w:pPr>
-            <w:r>
-              <w:t xml:space="preserve">nan</w:t>
-            </w:r>
-          </w:p>
-        </w:tc>
-        <w:tc>
-          <w:tcPr/>
-          <w:p>
-            <w:pPr>
-              <w:pStyle w:val="Compact"/>
-            </w:pPr>
-            <w:r>
-              <w:t xml:space="preserve">2022</w:t>
-            </w:r>
-          </w:p>
-        </w:tc>
-        <w:tc>
-          <w:tcPr/>
-          <w:p>
-            <w:pPr>
-              <w:pStyle w:val="Compact"/>
-            </w:pPr>
-            <w:r>
-              <w:t xml:space="preserve">sentiment</w:t>
-            </w:r>
-          </w:p>
-        </w:tc>
-        <w:tc>
-          <w:tcPr/>
-          <w:p>
-            <w:pPr>
-              <w:pStyle w:val="Compact"/>
-            </w:pPr>
-            <w:r>
-              <w:t xml:space="preserve">nan</w:t>
-            </w:r>
-          </w:p>
-        </w:tc>
-        <w:tc>
-          <w:tcPr/>
-          <w:p>
-            <w:pPr>
-              <w:pStyle w:val="Compact"/>
-            </w:pPr>
-            <w:hyperlink r:id="rId116">
-              <w:r>
-                <w:rPr>
-                  <w:rStyle w:val="Hyperlink"/>
-                </w:rPr>
-                <w:t xml:space="preserve">link</w:t>
-              </w:r>
-            </w:hyperlink>
-          </w:p>
-        </w:tc>
-      </w:tr>
-      <w:tr>
-        <w:tc>
-          <w:tcPr/>
-          <w:p>
-            <w:pPr>
-              <w:pStyle w:val="Compact"/>
-            </w:pPr>
-            <w:r>
-              <w:t xml:space="preserve">nan</w:t>
-            </w:r>
-          </w:p>
-        </w:tc>
-        <w:tc>
-          <w:tcPr/>
-          <w:p>
-            <w:pPr>
-              <w:pStyle w:val="Compact"/>
-            </w:pPr>
-            <w:r>
-              <w:t xml:space="preserve">2021</w:t>
-            </w:r>
-          </w:p>
-        </w:tc>
-        <w:tc>
-          <w:tcPr/>
-          <w:p>
-            <w:pPr>
-              <w:pStyle w:val="Compact"/>
-            </w:pPr>
-            <w:r>
-              <w:t xml:space="preserve">sentiment</w:t>
-            </w:r>
-          </w:p>
-        </w:tc>
-        <w:tc>
-          <w:tcPr/>
-          <w:p>
-            <w:pPr>
-              <w:pStyle w:val="Compact"/>
-            </w:pPr>
-            <w:r>
-              <w:t xml:space="preserve">nan</w:t>
-            </w:r>
-          </w:p>
-        </w:tc>
-        <w:tc>
-          <w:tcPr/>
-          <w:p>
-            <w:pPr>
-              <w:pStyle w:val="Compact"/>
-            </w:pPr>
-            <w:hyperlink r:id="rId117">
-              <w:r>
-                <w:rPr>
-                  <w:rStyle w:val="Hyperlink"/>
-                </w:rPr>
-                <w:t xml:space="preserve">link</w:t>
-              </w:r>
-            </w:hyperlink>
-          </w:p>
-        </w:tc>
-      </w:tr>
-      <w:tr>
-        <w:tc>
-          <w:tcPr/>
-          <w:p>
-            <w:pPr>
-              <w:pStyle w:val="Compact"/>
-            </w:pPr>
-            <w:r>
-              <w:t xml:space="preserve">nan</w:t>
-            </w:r>
-          </w:p>
-        </w:tc>
-        <w:tc>
-          <w:tcPr/>
-          <w:p>
-            <w:pPr>
-              <w:pStyle w:val="Compact"/>
-            </w:pPr>
-            <w:r>
-              <w:t xml:space="preserve">2021</w:t>
-            </w:r>
-          </w:p>
-        </w:tc>
-        <w:tc>
-          <w:tcPr/>
-          <w:p>
-            <w:pPr>
-              <w:pStyle w:val="Compact"/>
-            </w:pPr>
-            <w:r>
-              <w:t xml:space="preserve">ser</w:t>
-            </w:r>
-          </w:p>
-        </w:tc>
-        <w:tc>
-          <w:tcPr/>
-          <w:p>
-            <w:pPr>
-              <w:pStyle w:val="Compact"/>
-            </w:pPr>
-            <w:r>
-              <w:t xml:space="preserve">nan</w:t>
-            </w:r>
-          </w:p>
-        </w:tc>
-        <w:tc>
-          <w:tcPr/>
-          <w:p>
-            <w:pPr>
-              <w:pStyle w:val="Compact"/>
-            </w:pPr>
-            <w:hyperlink r:id="rId118">
-              <w:r>
-                <w:rPr>
-                  <w:rStyle w:val="Hyperlink"/>
-                </w:rPr>
-                <w:t xml:space="preserve">link</w:t>
-              </w:r>
-            </w:hyperlink>
-          </w:p>
-        </w:tc>
-      </w:tr>
-      <w:tr>
-        <w:tc>
-          <w:tcPr/>
-          <w:p>
-            <w:pPr>
-              <w:pStyle w:val="Compact"/>
-            </w:pPr>
-            <w:r>
-              <w:t xml:space="preserve">nan</w:t>
-            </w:r>
-          </w:p>
-        </w:tc>
-        <w:tc>
-          <w:tcPr/>
-          <w:p>
-            <w:pPr>
-              <w:pStyle w:val="Compact"/>
-            </w:pPr>
-            <w:r>
-              <w:t xml:space="preserve">2018</w:t>
-            </w:r>
-          </w:p>
-        </w:tc>
-        <w:tc>
-          <w:tcPr/>
-          <w:p>
-            <w:pPr>
-              <w:pStyle w:val="Compact"/>
-            </w:pPr>
-            <w:r>
-              <w:t xml:space="preserve">sentiment</w:t>
-            </w:r>
-          </w:p>
-        </w:tc>
-        <w:tc>
-          <w:tcPr/>
-          <w:p>
-            <w:pPr>
-              <w:pStyle w:val="Compact"/>
-            </w:pPr>
-            <w:r>
-              <w:t xml:space="preserve">nan</w:t>
-            </w:r>
-          </w:p>
-        </w:tc>
-        <w:tc>
-          <w:tcPr/>
-          <w:p>
-            <w:pPr>
-              <w:pStyle w:val="Compact"/>
-            </w:pPr>
-            <w:hyperlink r:id="rId119">
-              <w:r>
-                <w:rPr>
-                  <w:rStyle w:val="Hyperlink"/>
-                </w:rPr>
-                <w:t xml:space="preserve">link</w:t>
-              </w:r>
-            </w:hyperlink>
-          </w:p>
-        </w:tc>
-      </w:tr>
     </w:tbl>
-    <w:bookmarkEnd w:id="120"/>
-    <w:bookmarkStart w:id="122" w:name="model-1"/>
+    <w:bookmarkEnd w:id="131"/>
+    <w:bookmarkStart w:id="133" w:name="model-1"/>
     <w:p>
       <w:pPr>
         <w:pStyle w:val="Heading5"/>
@@ -24204,7 +24149,7 @@
             <w:pPr>
               <w:pStyle w:val="Compact"/>
             </w:pPr>
-            <w:hyperlink r:id="rId121">
+            <w:hyperlink r:id="rId132">
               <w:r>
                 <w:rPr>
                   <w:rStyle w:val="Hyperlink"/>
@@ -24216,8 +24161,8 @@
         </w:tc>
       </w:tr>
     </w:tbl>
-    <w:bookmarkEnd w:id="122"/>
-    <w:bookmarkStart w:id="138" w:name="paper-150"/>
+    <w:bookmarkEnd w:id="133"/>
+    <w:bookmarkStart w:id="144" w:name="paper-150"/>
     <w:p>
       <w:pPr>
         <w:pStyle w:val="Heading5"/>
@@ -24351,688 +24296,6 @@
             <w:pPr>
               <w:pStyle w:val="Compact"/>
             </w:pPr>
-            <w:hyperlink r:id="rId123">
-              <w:r>
-                <w:rPr>
-                  <w:rStyle w:val="Hyperlink"/>
-                </w:rPr>
-                <w:t xml:space="preserve">link</w:t>
-              </w:r>
-            </w:hyperlink>
-          </w:p>
-        </w:tc>
-      </w:tr>
-      <w:tr>
-        <w:tc>
-          <w:tcPr/>
-          <w:p>
-            <w:pPr>
-              <w:pStyle w:val="Compact"/>
-            </w:pPr>
-            <w:r>
-              <w:t xml:space="preserve">A Novel Dual-Order Hybrid BiLSTM–BiGRU Ensemble Model for English-Bengali Code-Mixed Sentiment Analysis</w:t>
-            </w:r>
-          </w:p>
-        </w:tc>
-        <w:tc>
-          <w:tcPr/>
-          <w:p>
-            <w:pPr>
-              <w:pStyle w:val="Compact"/>
-            </w:pPr>
-            <w:r>
-              <w:t xml:space="preserve">2026</w:t>
-            </w:r>
-          </w:p>
-        </w:tc>
-        <w:tc>
-          <w:tcPr/>
-          <w:p>
-            <w:pPr>
-              <w:pStyle w:val="Compact"/>
-            </w:pPr>
-            <w:r>
-              <w:t xml:space="preserve">sentiment</w:t>
-            </w:r>
-          </w:p>
-        </w:tc>
-        <w:tc>
-          <w:tcPr/>
-          <w:p>
-            <w:pPr>
-              <w:pStyle w:val="Compact"/>
-            </w:pPr>
-            <w:r>
-              <w:t xml:space="preserve">Engineering Technology &amp; Applied Science</w:t>
-            </w:r>
-          </w:p>
-        </w:tc>
-        <w:tc>
-          <w:tcPr/>
-          <w:p>
-            <w:pPr>
-              <w:pStyle w:val="Compact"/>
-            </w:pPr>
-            <w:hyperlink r:id="rId124">
-              <w:r>
-                <w:rPr>
-                  <w:rStyle w:val="Hyperlink"/>
-                </w:rPr>
-                <w:t xml:space="preserve">link</w:t>
-              </w:r>
-            </w:hyperlink>
-          </w:p>
-        </w:tc>
-      </w:tr>
-      <w:tr>
-        <w:tc>
-          <w:tcPr/>
-          <w:p>
-            <w:pPr>
-              <w:pStyle w:val="Compact"/>
-            </w:pPr>
-            <w:r>
-              <w:t xml:space="preserve">A Deep Learning–Based Framework for Dataset Creation and Sentiment Classification of English–Bengali Code-Mixe</w:t>
-            </w:r>
-          </w:p>
-        </w:tc>
-        <w:tc>
-          <w:tcPr/>
-          <w:p>
-            <w:pPr>
-              <w:pStyle w:val="Compact"/>
-            </w:pPr>
-            <w:r>
-              <w:t xml:space="preserve">2026</w:t>
-            </w:r>
-          </w:p>
-        </w:tc>
-        <w:tc>
-          <w:tcPr/>
-          <w:p>
-            <w:pPr>
-              <w:pStyle w:val="Compact"/>
-            </w:pPr>
-            <w:r>
-              <w:t xml:space="preserve">sentiment</w:t>
-            </w:r>
-          </w:p>
-        </w:tc>
-        <w:tc>
-          <w:tcPr/>
-          <w:p>
-            <w:pPr>
-              <w:pStyle w:val="Compact"/>
-            </w:pPr>
-            <w:r>
-              <w:t xml:space="preserve">Engineering Technology &amp; Applied Science</w:t>
-            </w:r>
-          </w:p>
-        </w:tc>
-        <w:tc>
-          <w:tcPr/>
-          <w:p>
-            <w:pPr>
-              <w:pStyle w:val="Compact"/>
-            </w:pPr>
-            <w:hyperlink r:id="rId125">
-              <w:r>
-                <w:rPr>
-                  <w:rStyle w:val="Hyperlink"/>
-                </w:rPr>
-                <w:t xml:space="preserve">link</w:t>
-              </w:r>
-            </w:hyperlink>
-          </w:p>
-        </w:tc>
-      </w:tr>
-      <w:tr>
-        <w:tc>
-          <w:tcPr/>
-          <w:p>
-            <w:pPr>
-              <w:pStyle w:val="Compact"/>
-            </w:pPr>
-            <w:r>
-              <w:t xml:space="preserve">A multi-class classification approach for feminist sentiment analysis in Bangla social media using TF-IDF and</w:t>
-            </w:r>
-          </w:p>
-        </w:tc>
-        <w:tc>
-          <w:tcPr/>
-          <w:p>
-            <w:pPr>
-              <w:pStyle w:val="Compact"/>
-            </w:pPr>
-            <w:r>
-              <w:t xml:space="preserve">2026</w:t>
-            </w:r>
-          </w:p>
-        </w:tc>
-        <w:tc>
-          <w:tcPr/>
-          <w:p>
-            <w:pPr>
-              <w:pStyle w:val="Compact"/>
-            </w:pPr>
-            <w:r>
-              <w:t xml:space="preserve">sentiment</w:t>
-            </w:r>
-          </w:p>
-        </w:tc>
-        <w:tc>
-          <w:tcPr/>
-          <w:p>
-            <w:pPr>
-              <w:pStyle w:val="Compact"/>
-            </w:pPr>
-            <w:r>
-              <w:t xml:space="preserve">Indonesian Journal of Electrical Enginee</w:t>
-            </w:r>
-          </w:p>
-        </w:tc>
-        <w:tc>
-          <w:tcPr/>
-          <w:p>
-            <w:pPr>
-              <w:pStyle w:val="Compact"/>
-            </w:pPr>
-            <w:hyperlink r:id="rId126">
-              <w:r>
-                <w:rPr>
-                  <w:rStyle w:val="Hyperlink"/>
-                </w:rPr>
-                <w:t xml:space="preserve">link</w:t>
-              </w:r>
-            </w:hyperlink>
-          </w:p>
-        </w:tc>
-      </w:tr>
-      <w:tr>
-        <w:tc>
-          <w:tcPr/>
-          <w:p>
-            <w:pPr>
-              <w:pStyle w:val="Compact"/>
-            </w:pPr>
-            <w:r>
-              <w:t xml:space="preserve">SSABE-TSCM: drift-aware and interpretable financial sentiment analysis for low-resource Bangla via adaptive se</w:t>
-            </w:r>
-          </w:p>
-        </w:tc>
-        <w:tc>
-          <w:tcPr/>
-          <w:p>
-            <w:pPr>
-              <w:pStyle w:val="Compact"/>
-            </w:pPr>
-            <w:r>
-              <w:t xml:space="preserve">2026</w:t>
-            </w:r>
-          </w:p>
-        </w:tc>
-        <w:tc>
-          <w:tcPr/>
-          <w:p>
-            <w:pPr>
-              <w:pStyle w:val="Compact"/>
-            </w:pPr>
-            <w:r>
-              <w:t xml:space="preserve">sentiment</w:t>
-            </w:r>
-          </w:p>
-        </w:tc>
-        <w:tc>
-          <w:tcPr/>
-          <w:p>
-            <w:pPr>
-              <w:pStyle w:val="Compact"/>
-            </w:pPr>
-            <w:r>
-              <w:t xml:space="preserve">Frontiers in Artificial Intelligence</w:t>
-            </w:r>
-          </w:p>
-        </w:tc>
-        <w:tc>
-          <w:tcPr/>
-          <w:p>
-            <w:pPr>
-              <w:pStyle w:val="Compact"/>
-            </w:pPr>
-            <w:hyperlink r:id="rId127">
-              <w:r>
-                <w:rPr>
-                  <w:rStyle w:val="Hyperlink"/>
-                </w:rPr>
-                <w:t xml:space="preserve">link</w:t>
-              </w:r>
-            </w:hyperlink>
-          </w:p>
-        </w:tc>
-      </w:tr>
-      <w:tr>
-        <w:tc>
-          <w:tcPr/>
-          <w:p>
-            <w:pPr>
-              <w:pStyle w:val="Compact"/>
-            </w:pPr>
-            <w:r>
-              <w:t xml:space="preserve">Two-Stage Bengali Sentiment Classification: Domain Adaptation Through Continual Learning and Parameter-Efficie</w:t>
-            </w:r>
-          </w:p>
-        </w:tc>
-        <w:tc>
-          <w:tcPr/>
-          <w:p>
-            <w:pPr>
-              <w:pStyle w:val="Compact"/>
-            </w:pPr>
-            <w:r>
-              <w:t xml:space="preserve">2026</w:t>
-            </w:r>
-          </w:p>
-        </w:tc>
-        <w:tc>
-          <w:tcPr/>
-          <w:p>
-            <w:pPr>
-              <w:pStyle w:val="Compact"/>
-            </w:pPr>
-            <w:r>
-              <w:t xml:space="preserve">sentiment</w:t>
-            </w:r>
-          </w:p>
-        </w:tc>
-        <w:tc>
-          <w:tcPr/>
-          <w:p>
-            <w:pPr>
-              <w:pStyle w:val="Compact"/>
-            </w:pPr>
-            <w:r>
-              <w:t xml:space="preserve">arXiv</w:t>
-            </w:r>
-          </w:p>
-        </w:tc>
-        <w:tc>
-          <w:tcPr/>
-          <w:p>
-            <w:pPr>
-              <w:pStyle w:val="Compact"/>
-            </w:pPr>
-            <w:hyperlink r:id="rId128">
-              <w:r>
-                <w:rPr>
-                  <w:rStyle w:val="Hyperlink"/>
-                </w:rPr>
-                <w:t xml:space="preserve">link</w:t>
-              </w:r>
-            </w:hyperlink>
-          </w:p>
-        </w:tc>
-      </w:tr>
-      <w:tr>
-        <w:tc>
-          <w:tcPr/>
-          <w:p>
-            <w:pPr>
-              <w:pStyle w:val="Compact"/>
-            </w:pPr>
-            <w:r>
-              <w:t xml:space="preserve">Beyond Polarity in Bengali Texts: Can Multi-Task Modeling Capture Sarcasm Intensity and Classification?</w:t>
-            </w:r>
-          </w:p>
-        </w:tc>
-        <w:tc>
-          <w:tcPr/>
-          <w:p>
-            <w:pPr>
-              <w:pStyle w:val="Compact"/>
-            </w:pPr>
-            <w:r>
-              <w:t xml:space="preserve">2026</w:t>
-            </w:r>
-          </w:p>
-        </w:tc>
-        <w:tc>
-          <w:tcPr/>
-          <w:p>
-            <w:pPr>
-              <w:pStyle w:val="Compact"/>
-            </w:pPr>
-            <w:r>
-              <w:t xml:space="preserve">sentiment</w:t>
-            </w:r>
-          </w:p>
-        </w:tc>
-        <w:tc>
-          <w:tcPr/>
-          <w:p>
-            <w:pPr>
-              <w:pStyle w:val="Compact"/>
-            </w:pPr>
-            <w:r>
-              <w:t xml:space="preserve">IEEE Open Journal of the Computer Societ</w:t>
-            </w:r>
-          </w:p>
-        </w:tc>
-        <w:tc>
-          <w:tcPr/>
-          <w:p>
-            <w:pPr>
-              <w:pStyle w:val="Compact"/>
-            </w:pPr>
-            <w:hyperlink r:id="rId129">
-              <w:r>
-                <w:rPr>
-                  <w:rStyle w:val="Hyperlink"/>
-                </w:rPr>
-                <w:t xml:space="preserve">link</w:t>
-              </w:r>
-            </w:hyperlink>
-          </w:p>
-        </w:tc>
-      </w:tr>
-      <w:tr>
-        <w:tc>
-          <w:tcPr/>
-          <w:p>
-            <w:pPr>
-              <w:pStyle w:val="Compact"/>
-            </w:pPr>
-            <w:r>
-              <w:t xml:space="preserve">A Multi-Model Approach to English-Bangla Sentiment Classification of Government Mobile Banking App Reviews</w:t>
-            </w:r>
-          </w:p>
-        </w:tc>
-        <w:tc>
-          <w:tcPr/>
-          <w:p>
-            <w:pPr>
-              <w:pStyle w:val="Compact"/>
-            </w:pPr>
-            <w:r>
-              <w:t xml:space="preserve">2026</w:t>
-            </w:r>
-          </w:p>
-        </w:tc>
-        <w:tc>
-          <w:tcPr/>
-          <w:p>
-            <w:pPr>
-              <w:pStyle w:val="Compact"/>
-            </w:pPr>
-            <w:r>
-              <w:t xml:space="preserve">sentiment</w:t>
-            </w:r>
-          </w:p>
-        </w:tc>
-        <w:tc>
-          <w:tcPr/>
-          <w:p>
-            <w:pPr>
-              <w:pStyle w:val="Compact"/>
-            </w:pPr>
-            <w:r>
-              <w:t xml:space="preserve">arXiv</w:t>
-            </w:r>
-          </w:p>
-        </w:tc>
-        <w:tc>
-          <w:tcPr/>
-          <w:p>
-            <w:pPr>
-              <w:pStyle w:val="Compact"/>
-            </w:pPr>
-            <w:hyperlink r:id="rId130">
-              <w:r>
-                <w:rPr>
-                  <w:rStyle w:val="Hyperlink"/>
-                </w:rPr>
-                <w:t xml:space="preserve">link</w:t>
-              </w:r>
-            </w:hyperlink>
-          </w:p>
-        </w:tc>
-      </w:tr>
-      <w:tr>
-        <w:tc>
-          <w:tcPr/>
-          <w:p>
-            <w:pPr>
-              <w:pStyle w:val="Compact"/>
-            </w:pPr>
-            <w:r>
-              <w:t xml:space="preserve">BABSA: A large scale bangla aspect based sentiment analysis dataset</w:t>
-            </w:r>
-          </w:p>
-        </w:tc>
-        <w:tc>
-          <w:tcPr/>
-          <w:p>
-            <w:pPr>
-              <w:pStyle w:val="Compact"/>
-            </w:pPr>
-            <w:r>
-              <w:t xml:space="preserve">2026</w:t>
-            </w:r>
-          </w:p>
-        </w:tc>
-        <w:tc>
-          <w:tcPr/>
-          <w:p>
-            <w:pPr>
-              <w:pStyle w:val="Compact"/>
-            </w:pPr>
-            <w:r>
-              <w:t xml:space="preserve">sentiment</w:t>
-            </w:r>
-          </w:p>
-        </w:tc>
-        <w:tc>
-          <w:tcPr/>
-          <w:p>
-            <w:pPr>
-              <w:pStyle w:val="Compact"/>
-            </w:pPr>
-            <w:r>
-              <w:t xml:space="preserve">Data in Brief</w:t>
-            </w:r>
-          </w:p>
-        </w:tc>
-        <w:tc>
-          <w:tcPr/>
-          <w:p>
-            <w:pPr>
-              <w:pStyle w:val="Compact"/>
-            </w:pPr>
-            <w:hyperlink r:id="rId131">
-              <w:r>
-                <w:rPr>
-                  <w:rStyle w:val="Hyperlink"/>
-                </w:rPr>
-                <w:t xml:space="preserve">link</w:t>
-              </w:r>
-            </w:hyperlink>
-          </w:p>
-        </w:tc>
-      </w:tr>
-      <w:tr>
-        <w:tc>
-          <w:tcPr/>
-          <w:p>
-            <w:pPr>
-              <w:pStyle w:val="Compact"/>
-            </w:pPr>
-            <w:r>
-              <w:t xml:space="preserve">BAN-ASTE: A unified neural framework for Bengali aspect sentiment triplet extraction</w:t>
-            </w:r>
-          </w:p>
-        </w:tc>
-        <w:tc>
-          <w:tcPr/>
-          <w:p>
-            <w:pPr>
-              <w:pStyle w:val="Compact"/>
-            </w:pPr>
-            <w:r>
-              <w:t xml:space="preserve">2026</w:t>
-            </w:r>
-          </w:p>
-        </w:tc>
-        <w:tc>
-          <w:tcPr/>
-          <w:p>
-            <w:pPr>
-              <w:pStyle w:val="Compact"/>
-            </w:pPr>
-            <w:r>
-              <w:t xml:space="preserve">sentiment</w:t>
-            </w:r>
-          </w:p>
-        </w:tc>
-        <w:tc>
-          <w:tcPr/>
-          <w:p>
-            <w:pPr>
-              <w:pStyle w:val="Compact"/>
-            </w:pPr>
-            <w:r>
-              <w:t xml:space="preserve">Natural Language Processing Journal</w:t>
-            </w:r>
-          </w:p>
-        </w:tc>
-        <w:tc>
-          <w:tcPr/>
-          <w:p>
-            <w:pPr>
-              <w:pStyle w:val="Compact"/>
-            </w:pPr>
-            <w:hyperlink r:id="rId132">
-              <w:r>
-                <w:rPr>
-                  <w:rStyle w:val="Hyperlink"/>
-                </w:rPr>
-                <w:t xml:space="preserve">link</w:t>
-              </w:r>
-            </w:hyperlink>
-          </w:p>
-        </w:tc>
-      </w:tr>
-      <w:tr>
-        <w:tc>
-          <w:tcPr/>
-          <w:p>
-            <w:pPr>
-              <w:pStyle w:val="Compact"/>
-            </w:pPr>
-            <w:r>
-              <w:t xml:space="preserve">Bengali Emotion Classification from Social Media Text Using Deep Learning and Transformer-Based Models with Ex</w:t>
-            </w:r>
-          </w:p>
-        </w:tc>
-        <w:tc>
-          <w:tcPr/>
-          <w:p>
-            <w:pPr>
-              <w:pStyle w:val="Compact"/>
-            </w:pPr>
-            <w:r>
-              <w:t xml:space="preserve">2026</w:t>
-            </w:r>
-          </w:p>
-        </w:tc>
-        <w:tc>
-          <w:tcPr/>
-          <w:p>
-            <w:pPr>
-              <w:pStyle w:val="Compact"/>
-            </w:pPr>
-            <w:r>
-              <w:t xml:space="preserve">sentiment</w:t>
-            </w:r>
-          </w:p>
-        </w:tc>
-        <w:tc>
-          <w:tcPr/>
-          <w:p>
-            <w:pPr>
-              <w:pStyle w:val="Compact"/>
-            </w:pPr>
-            <w:r>
-              <w:t xml:space="preserve">Journal of Engineering Research and Scie</w:t>
-            </w:r>
-          </w:p>
-        </w:tc>
-        <w:tc>
-          <w:tcPr/>
-          <w:p>
-            <w:pPr>
-              <w:pStyle w:val="Compact"/>
-            </w:pPr>
-            <w:hyperlink r:id="rId133">
-              <w:r>
-                <w:rPr>
-                  <w:rStyle w:val="Hyperlink"/>
-                </w:rPr>
-                <w:t xml:space="preserve">link</w:t>
-              </w:r>
-            </w:hyperlink>
-          </w:p>
-        </w:tc>
-      </w:tr>
-      <w:tr>
-        <w:tc>
-          <w:tcPr/>
-          <w:p>
-            <w:pPr>
-              <w:pStyle w:val="Compact"/>
-            </w:pPr>
-            <w:r>
-              <w:t xml:space="preserve">Bangla Suicidal Ideation Detection: Performance and Efficiency Benchmark of Simple and Complex Classifiers on</w:t>
-            </w:r>
-          </w:p>
-        </w:tc>
-        <w:tc>
-          <w:tcPr/>
-          <w:p>
-            <w:pPr>
-              <w:pStyle w:val="Compact"/>
-            </w:pPr>
-            <w:r>
-              <w:t xml:space="preserve">2026</w:t>
-            </w:r>
-          </w:p>
-        </w:tc>
-        <w:tc>
-          <w:tcPr/>
-          <w:p>
-            <w:pPr>
-              <w:pStyle w:val="Compact"/>
-            </w:pPr>
-            <w:r>
-              <w:t xml:space="preserve">sentiment</w:t>
-            </w:r>
-          </w:p>
-        </w:tc>
-        <w:tc>
-          <w:tcPr/>
-          <w:p>
-            <w:pPr>
-              <w:pStyle w:val="Compact"/>
-            </w:pPr>
-            <w:r>
-              <w:t xml:space="preserve">The Journal of Applied Technology and In</w:t>
-            </w:r>
-          </w:p>
-        </w:tc>
-        <w:tc>
-          <w:tcPr/>
-          <w:p>
-            <w:pPr>
-              <w:pStyle w:val="Compact"/>
-            </w:pPr>
             <w:hyperlink r:id="rId134">
               <w:r>
                 <w:rPr>
@@ -25052,7 +24315,7 @@
               <w:pStyle w:val="Compact"/>
             </w:pPr>
             <w:r>
-              <w:t xml:space="preserve">What’s on Your Mind? - Mental Health Disorder Risk Detection From Bangla Social Media Text Using Weighted Ense</w:t>
+              <w:t xml:space="preserve">A Novel Dual-Order Hybrid BiLSTM–BiGRU Ensemble Model for English-Bengali Code-Mixed Sentiment Analysis</w:t>
             </w:r>
           </w:p>
         </w:tc>
@@ -25085,7 +24348,7 @@
               <w:pStyle w:val="Compact"/>
             </w:pPr>
             <w:r>
-              <w:t xml:space="preserve">Journal of Technology in Behavioral Scie</w:t>
+              <w:t xml:space="preserve">Engineering Technology &amp; Applied Science</w:t>
             </w:r>
           </w:p>
         </w:tc>
@@ -25114,7 +24377,7 @@
               <w:pStyle w:val="Compact"/>
             </w:pPr>
             <w:r>
-              <w:t xml:space="preserve">When Words Don’t Mean What They Say: Figurative Understanding in Bengali Idioms</w:t>
+              <w:t xml:space="preserve">A Deep Learning–Based Framework for Dataset Creation and Sentiment Classification of English–Bengali Code-Mixe</w:t>
             </w:r>
           </w:p>
         </w:tc>
@@ -25147,7 +24410,7 @@
               <w:pStyle w:val="Compact"/>
             </w:pPr>
             <w:r>
-              <w:t xml:space="preserve">arXiv</w:t>
+              <w:t xml:space="preserve">Engineering Technology &amp; Applied Science</w:t>
             </w:r>
           </w:p>
         </w:tc>
@@ -25176,7 +24439,7 @@
               <w:pStyle w:val="Compact"/>
             </w:pPr>
             <w:r>
-              <w:t xml:space="preserve">Enhancing Mental Health Counseling Support in Bangladesh using Culturally-grounded Knowledge</w:t>
+              <w:t xml:space="preserve">A multi-class classification approach for feminist sentiment analysis in Bangla social media using TF-IDF and</w:t>
             </w:r>
           </w:p>
         </w:tc>
@@ -25209,7 +24472,7 @@
               <w:pStyle w:val="Compact"/>
             </w:pPr>
             <w:r>
-              <w:t xml:space="preserve">CLP</w:t>
+              <w:t xml:space="preserve">Indonesian Journal of Electrical Enginee</w:t>
             </w:r>
           </w:p>
         </w:tc>
@@ -25230,9 +24493,381 @@
           </w:p>
         </w:tc>
       </w:tr>
+      <w:tr>
+        <w:tc>
+          <w:tcPr/>
+          <w:p>
+            <w:pPr>
+              <w:pStyle w:val="Compact"/>
+            </w:pPr>
+            <w:r>
+              <w:t xml:space="preserve">SSABE-TSCM: drift-aware and interpretable financial sentiment analysis for low-resource Bangla via adaptive se</w:t>
+            </w:r>
+          </w:p>
+        </w:tc>
+        <w:tc>
+          <w:tcPr/>
+          <w:p>
+            <w:pPr>
+              <w:pStyle w:val="Compact"/>
+            </w:pPr>
+            <w:r>
+              <w:t xml:space="preserve">2026</w:t>
+            </w:r>
+          </w:p>
+        </w:tc>
+        <w:tc>
+          <w:tcPr/>
+          <w:p>
+            <w:pPr>
+              <w:pStyle w:val="Compact"/>
+            </w:pPr>
+            <w:r>
+              <w:t xml:space="preserve">sentiment</w:t>
+            </w:r>
+          </w:p>
+        </w:tc>
+        <w:tc>
+          <w:tcPr/>
+          <w:p>
+            <w:pPr>
+              <w:pStyle w:val="Compact"/>
+            </w:pPr>
+            <w:r>
+              <w:t xml:space="preserve">Frontiers in Artificial Intelligence</w:t>
+            </w:r>
+          </w:p>
+        </w:tc>
+        <w:tc>
+          <w:tcPr/>
+          <w:p>
+            <w:pPr>
+              <w:pStyle w:val="Compact"/>
+            </w:pPr>
+            <w:hyperlink r:id="rId138">
+              <w:r>
+                <w:rPr>
+                  <w:rStyle w:val="Hyperlink"/>
+                </w:rPr>
+                <w:t xml:space="preserve">link</w:t>
+              </w:r>
+            </w:hyperlink>
+          </w:p>
+        </w:tc>
+      </w:tr>
+      <w:tr>
+        <w:tc>
+          <w:tcPr/>
+          <w:p>
+            <w:pPr>
+              <w:pStyle w:val="Compact"/>
+            </w:pPr>
+            <w:r>
+              <w:t xml:space="preserve">Two-Stage Bengali Sentiment Classification: Domain Adaptation Through Continual Learning and Parameter-Efficie</w:t>
+            </w:r>
+          </w:p>
+        </w:tc>
+        <w:tc>
+          <w:tcPr/>
+          <w:p>
+            <w:pPr>
+              <w:pStyle w:val="Compact"/>
+            </w:pPr>
+            <w:r>
+              <w:t xml:space="preserve">2026</w:t>
+            </w:r>
+          </w:p>
+        </w:tc>
+        <w:tc>
+          <w:tcPr/>
+          <w:p>
+            <w:pPr>
+              <w:pStyle w:val="Compact"/>
+            </w:pPr>
+            <w:r>
+              <w:t xml:space="preserve">sentiment</w:t>
+            </w:r>
+          </w:p>
+        </w:tc>
+        <w:tc>
+          <w:tcPr/>
+          <w:p>
+            <w:pPr>
+              <w:pStyle w:val="Compact"/>
+            </w:pPr>
+            <w:r>
+              <w:t xml:space="preserve">arXiv</w:t>
+            </w:r>
+          </w:p>
+        </w:tc>
+        <w:tc>
+          <w:tcPr/>
+          <w:p>
+            <w:pPr>
+              <w:pStyle w:val="Compact"/>
+            </w:pPr>
+            <w:hyperlink r:id="rId139">
+              <w:r>
+                <w:rPr>
+                  <w:rStyle w:val="Hyperlink"/>
+                </w:rPr>
+                <w:t xml:space="preserve">link</w:t>
+              </w:r>
+            </w:hyperlink>
+          </w:p>
+        </w:tc>
+      </w:tr>
+      <w:tr>
+        <w:tc>
+          <w:tcPr/>
+          <w:p>
+            <w:pPr>
+              <w:pStyle w:val="Compact"/>
+            </w:pPr>
+            <w:r>
+              <w:t xml:space="preserve">Beyond Polarity in Bengali Texts: Can Multi-Task Modeling Capture Sarcasm Intensity and Classification?</w:t>
+            </w:r>
+          </w:p>
+        </w:tc>
+        <w:tc>
+          <w:tcPr/>
+          <w:p>
+            <w:pPr>
+              <w:pStyle w:val="Compact"/>
+            </w:pPr>
+            <w:r>
+              <w:t xml:space="preserve">2026</w:t>
+            </w:r>
+          </w:p>
+        </w:tc>
+        <w:tc>
+          <w:tcPr/>
+          <w:p>
+            <w:pPr>
+              <w:pStyle w:val="Compact"/>
+            </w:pPr>
+            <w:r>
+              <w:t xml:space="preserve">sentiment</w:t>
+            </w:r>
+          </w:p>
+        </w:tc>
+        <w:tc>
+          <w:tcPr/>
+          <w:p>
+            <w:pPr>
+              <w:pStyle w:val="Compact"/>
+            </w:pPr>
+            <w:r>
+              <w:t xml:space="preserve">IEEE Open Journal of the Computer Societ</w:t>
+            </w:r>
+          </w:p>
+        </w:tc>
+        <w:tc>
+          <w:tcPr/>
+          <w:p>
+            <w:pPr>
+              <w:pStyle w:val="Compact"/>
+            </w:pPr>
+            <w:hyperlink r:id="rId140">
+              <w:r>
+                <w:rPr>
+                  <w:rStyle w:val="Hyperlink"/>
+                </w:rPr>
+                <w:t xml:space="preserve">link</w:t>
+              </w:r>
+            </w:hyperlink>
+          </w:p>
+        </w:tc>
+      </w:tr>
+      <w:tr>
+        <w:tc>
+          <w:tcPr/>
+          <w:p>
+            <w:pPr>
+              <w:pStyle w:val="Compact"/>
+            </w:pPr>
+            <w:r>
+              <w:t xml:space="preserve">A Multi-Model Approach to English-Bangla Sentiment Classification of Government Mobile Banking App Reviews</w:t>
+            </w:r>
+          </w:p>
+        </w:tc>
+        <w:tc>
+          <w:tcPr/>
+          <w:p>
+            <w:pPr>
+              <w:pStyle w:val="Compact"/>
+            </w:pPr>
+            <w:r>
+              <w:t xml:space="preserve">2026</w:t>
+            </w:r>
+          </w:p>
+        </w:tc>
+        <w:tc>
+          <w:tcPr/>
+          <w:p>
+            <w:pPr>
+              <w:pStyle w:val="Compact"/>
+            </w:pPr>
+            <w:r>
+              <w:t xml:space="preserve">sentiment</w:t>
+            </w:r>
+          </w:p>
+        </w:tc>
+        <w:tc>
+          <w:tcPr/>
+          <w:p>
+            <w:pPr>
+              <w:pStyle w:val="Compact"/>
+            </w:pPr>
+            <w:r>
+              <w:t xml:space="preserve">arXiv</w:t>
+            </w:r>
+          </w:p>
+        </w:tc>
+        <w:tc>
+          <w:tcPr/>
+          <w:p>
+            <w:pPr>
+              <w:pStyle w:val="Compact"/>
+            </w:pPr>
+            <w:hyperlink r:id="rId141">
+              <w:r>
+                <w:rPr>
+                  <w:rStyle w:val="Hyperlink"/>
+                </w:rPr>
+                <w:t xml:space="preserve">link</w:t>
+              </w:r>
+            </w:hyperlink>
+          </w:p>
+        </w:tc>
+      </w:tr>
+      <w:tr>
+        <w:tc>
+          <w:tcPr/>
+          <w:p>
+            <w:pPr>
+              <w:pStyle w:val="Compact"/>
+            </w:pPr>
+            <w:r>
+              <w:t xml:space="preserve">BABSA: A large scale bangla aspect based sentiment analysis dataset</w:t>
+            </w:r>
+          </w:p>
+        </w:tc>
+        <w:tc>
+          <w:tcPr/>
+          <w:p>
+            <w:pPr>
+              <w:pStyle w:val="Compact"/>
+            </w:pPr>
+            <w:r>
+              <w:t xml:space="preserve">2026</w:t>
+            </w:r>
+          </w:p>
+        </w:tc>
+        <w:tc>
+          <w:tcPr/>
+          <w:p>
+            <w:pPr>
+              <w:pStyle w:val="Compact"/>
+            </w:pPr>
+            <w:r>
+              <w:t xml:space="preserve">sentiment</w:t>
+            </w:r>
+          </w:p>
+        </w:tc>
+        <w:tc>
+          <w:tcPr/>
+          <w:p>
+            <w:pPr>
+              <w:pStyle w:val="Compact"/>
+            </w:pPr>
+            <w:r>
+              <w:t xml:space="preserve">Data in Brief</w:t>
+            </w:r>
+          </w:p>
+        </w:tc>
+        <w:tc>
+          <w:tcPr/>
+          <w:p>
+            <w:pPr>
+              <w:pStyle w:val="Compact"/>
+            </w:pPr>
+            <w:hyperlink r:id="rId142">
+              <w:r>
+                <w:rPr>
+                  <w:rStyle w:val="Hyperlink"/>
+                </w:rPr>
+                <w:t xml:space="preserve">link</w:t>
+              </w:r>
+            </w:hyperlink>
+          </w:p>
+        </w:tc>
+      </w:tr>
+      <w:tr>
+        <w:tc>
+          <w:tcPr/>
+          <w:p>
+            <w:pPr>
+              <w:pStyle w:val="Compact"/>
+            </w:pPr>
+            <w:r>
+              <w:t xml:space="preserve">BAN-ASTE: A unified neural framework for Bengali aspect sentiment triplet extraction</w:t>
+            </w:r>
+          </w:p>
+        </w:tc>
+        <w:tc>
+          <w:tcPr/>
+          <w:p>
+            <w:pPr>
+              <w:pStyle w:val="Compact"/>
+            </w:pPr>
+            <w:r>
+              <w:t xml:space="preserve">2026</w:t>
+            </w:r>
+          </w:p>
+        </w:tc>
+        <w:tc>
+          <w:tcPr/>
+          <w:p>
+            <w:pPr>
+              <w:pStyle w:val="Compact"/>
+            </w:pPr>
+            <w:r>
+              <w:t xml:space="preserve">sentiment</w:t>
+            </w:r>
+          </w:p>
+        </w:tc>
+        <w:tc>
+          <w:tcPr/>
+          <w:p>
+            <w:pPr>
+              <w:pStyle w:val="Compact"/>
+            </w:pPr>
+            <w:r>
+              <w:t xml:space="preserve">Natural Language Processing Journal</w:t>
+            </w:r>
+          </w:p>
+        </w:tc>
+        <w:tc>
+          <w:tcPr/>
+          <w:p>
+            <w:pPr>
+              <w:pStyle w:val="Compact"/>
+            </w:pPr>
+            <w:hyperlink r:id="rId143">
+              <w:r>
+                <w:rPr>
+                  <w:rStyle w:val="Hyperlink"/>
+                </w:rPr>
+                <w:t xml:space="preserve">link</w:t>
+              </w:r>
+            </w:hyperlink>
+          </w:p>
+        </w:tc>
+      </w:tr>
     </w:tbl>
-    <w:bookmarkEnd w:id="138"/>
-    <w:bookmarkStart w:id="140" w:name="tool-1"/>
+    <w:bookmarkEnd w:id="144"/>
+    <w:bookmarkStart w:id="146" w:name="tool-1"/>
     <w:p>
       <w:pPr>
         <w:pStyle w:val="Heading5"/>
@@ -25362,7 +24997,7 @@
             <w:pPr>
               <w:pStyle w:val="Compact"/>
             </w:pPr>
-            <w:hyperlink r:id="rId139">
+            <w:hyperlink r:id="rId145">
               <w:r>
                 <w:rPr>
                   <w:rStyle w:val="Hyperlink"/>
@@ -25381,10 +25016,10 @@
         </w:pict>
       </w:r>
     </w:p>
-    <w:bookmarkEnd w:id="140"/>
-    <w:bookmarkEnd w:id="141"/>
-    <w:bookmarkEnd w:id="142"/>
-    <w:bookmarkStart w:id="144" w:name="references-1"/>
+    <w:bookmarkEnd w:id="146"/>
+    <w:bookmarkEnd w:id="147"/>
+    <w:bookmarkEnd w:id="148"/>
+    <w:bookmarkStart w:id="150" w:name="references-1"/>
     <w:p>
       <w:pPr>
         <w:pStyle w:val="Heading2"/>
@@ -26108,7 +25743,7 @@
         </w:pict>
       </w:r>
     </w:p>
-    <w:bookmarkStart w:id="143" w:name="bibtex-source"/>
+    <w:bookmarkStart w:id="149" w:name="bibtex-source"/>
     <w:p>
       <w:pPr>
         <w:pStyle w:val="Heading3"/>
@@ -30053,9 +29688,9 @@
         </w:pict>
       </w:r>
     </w:p>
-    <w:bookmarkEnd w:id="143"/>
-    <w:bookmarkEnd w:id="144"/>
-    <w:bookmarkStart w:id="146" w:name="appendix-b-repository-manifest"/>
+    <w:bookmarkEnd w:id="149"/>
+    <w:bookmarkEnd w:id="150"/>
+    <w:bookmarkStart w:id="152" w:name="appendix-b-repository-manifest"/>
     <w:p>
       <w:pPr>
         <w:pStyle w:val="Heading2"/>
@@ -30766,7 +30401,7 @@
         </w:tc>
       </w:tr>
     </w:tbl>
-    <w:bookmarkStart w:id="145" w:name="local-folder-location"/>
+    <w:bookmarkStart w:id="151" w:name="local-folder-location"/>
     <w:p>
       <w:pPr>
         <w:pStyle w:val="Heading3"/>
@@ -30794,9 +30429,9 @@
         <w:t xml:space="preserve">D:\Documents\qwen-agent\lUinoenfmc\default\Developing-a-Bangla-Sentiment-Analysis-System-Using-Fine-Tuned-BERT-Models</w:t>
       </w:r>
     </w:p>
-    <w:bookmarkEnd w:id="145"/>
-    <w:bookmarkEnd w:id="146"/>
-    <w:bookmarkEnd w:id="147"/>
+    <w:bookmarkEnd w:id="151"/>
+    <w:bookmarkEnd w:id="152"/>
+    <w:bookmarkEnd w:id="153"/>
     <w:sectPr>
       <w:footnotePr>
         <w:numRestart w:val="eachSect"/>

</xml_diff>